<commit_message>
Updated Project Documents. (Paper and Ppt of Phase2 Stage2)
</commit_message>
<xml_diff>
--- a/Documents/Conference_paper/fyp_paper_final_content.docx
+++ b/Documents/Conference_paper/fyp_paper_final_content.docx
@@ -801,63 +801,59 @@
           <w:sz w:val="20"/>
           <w:szCs w:val="20"/>
         </w:rPr>
-        <w:t xml:space="preserve">Diabetic neuropathy causes long-term health issues and is main reason for ulcers in feet, infection, and amputations in diabetic patients. Diabetic foot cases have been increasing </w:t>
-      </w:r>
-      <w:proofErr w:type="gramStart"/>
-      <w:r>
+        <w:t>Diabetic neuropathy causes long-term health issues and is main reason for ulcers in feet, infection, and amputations in diabetic patients. Diabetic foot cases have been increasing globally,  causing increased healthcare costs and decline in quality of life of patients. [12], [19]. Identifying neuropathic changes soon is quite important to avoid ulcer complications in diabetic feet patients.</w:t>
+      </w:r>
+    </w:p>
+    <w:p>
+      <w:pPr>
+        <w:pStyle w:val="NormalWeb"/>
+        <w:spacing w:before="12pt" w:beforeAutospacing="0" w:after="12pt" w:afterAutospacing="0"/>
+        <w:jc w:val="both"/>
         <w:rPr>
           <w:color w:val="000000"/>
           <w:sz w:val="20"/>
           <w:szCs w:val="20"/>
         </w:rPr>
-        <w:t>globally,  causing</w:t>
-      </w:r>
-      <w:proofErr w:type="gramEnd"/>
+      </w:pPr>
       <w:r>
         <w:rPr>
           <w:color w:val="000000"/>
           <w:sz w:val="20"/>
           <w:szCs w:val="20"/>
         </w:rPr>
-        <w:t xml:space="preserve"> increased healthcare costs and decline in quality of life of patients. [12], [19]. Identifying neuropathic changes soon is quite important to avoid ulcer complications in diabetic feet patients.</w:t>
-      </w:r>
-    </w:p>
-    <w:p>
-      <w:pPr>
-        <w:pStyle w:val="NormalWeb"/>
-        <w:spacing w:before="12pt" w:beforeAutospacing="0" w:after="12pt" w:afterAutospacing="0"/>
-        <w:jc w:val="both"/>
+        <w:t>The early physiological symptoms of diabetic foot complications is abnormal thermal distribution on plantar surface. Inflammation and microvascular issues related to neuropathy often come as localized temperature spikes and asymmetrical thermal patterns between left and right feet</w:t>
+      </w:r>
+      <w:r>
         <w:rPr>
           <w:color w:val="000000"/>
           <w:sz w:val="20"/>
           <w:szCs w:val="20"/>
         </w:rPr>
-      </w:pPr>
+        <w:t xml:space="preserve"> [17], [18]</w:t>
+      </w:r>
       <w:r>
         <w:rPr>
           <w:color w:val="000000"/>
           <w:sz w:val="20"/>
           <w:szCs w:val="20"/>
         </w:rPr>
-        <w:t xml:space="preserve">The early physiological symptoms of diabetic foot complications </w:t>
-      </w:r>
-      <w:proofErr w:type="gramStart"/>
+        <w:t>. Clinical studies have shown that monitoring foot skin temperature can help reduce ulcers</w:t>
+      </w:r>
       <w:r>
         <w:rPr>
           <w:color w:val="000000"/>
           <w:sz w:val="20"/>
           <w:szCs w:val="20"/>
         </w:rPr>
-        <w:t>is</w:t>
-      </w:r>
-      <w:proofErr w:type="gramEnd"/>
+        <w:t xml:space="preserve"> </w:t>
+      </w:r>
       <w:r>
         <w:rPr>
           <w:color w:val="000000"/>
           <w:sz w:val="20"/>
           <w:szCs w:val="20"/>
         </w:rPr>
-        <w:t xml:space="preserve"> abnormal thermal distribution on plantar surface. Inflammation and microvascular issues related to neuropathy often come as localized temperature spikes and asymmetrical thermal patterns between left and right feet</w:t>
+        <w:t>[1], [15]. Thermography modality of medical imaging is a</w:t>
       </w:r>
       <w:r>
         <w:rPr>
@@ -865,7 +861,7 @@
           <w:sz w:val="20"/>
           <w:szCs w:val="20"/>
         </w:rPr>
-        <w:t xml:space="preserve"> [17], [18]</w:t>
+        <w:t xml:space="preserve"> </w:t>
       </w:r>
       <w:r>
         <w:rPr>
@@ -873,95 +869,101 @@
           <w:sz w:val="20"/>
           <w:szCs w:val="20"/>
         </w:rPr>
-        <w:t>. Clinical studies have shown that monitoring foot skin temperature can help reduce ulcers</w:t>
-      </w:r>
-      <w:r>
+        <w:t>preferred non-invasive method for diagnosing such plantar thermal patterns in a reliable manner [2]-[4], [14].</w:t>
+      </w:r>
+    </w:p>
+    <w:p>
+      <w:pPr>
+        <w:pStyle w:val="NormalWeb"/>
+        <w:spacing w:before="12pt" w:beforeAutospacing="0" w:after="12pt" w:afterAutospacing="0"/>
+        <w:jc w:val="both"/>
         <w:rPr>
           <w:color w:val="000000"/>
           <w:sz w:val="20"/>
           <w:szCs w:val="20"/>
         </w:rPr>
-        <w:t xml:space="preserve"> </w:t>
-      </w:r>
+      </w:pPr>
       <w:r>
         <w:rPr>
           <w:color w:val="000000"/>
           <w:sz w:val="20"/>
           <w:szCs w:val="20"/>
         </w:rPr>
-        <w:t>[1], [15]. Thermography modality of medical imaging is a</w:t>
-      </w:r>
+        <w:t xml:space="preserve">Manual temperature measurements or predefined difference thresholds are main aspects in current clinical methods but these methods might not help fully understand complicated thermal distributions within thermograms that indicate </w:t>
+      </w:r>
+      <w:proofErr w:type="spellStart"/>
       <w:r>
         <w:rPr>
           <w:color w:val="000000"/>
           <w:sz w:val="20"/>
           <w:szCs w:val="20"/>
         </w:rPr>
-        <w:t xml:space="preserve"> </w:t>
-      </w:r>
+        <w:t>neuroapthy</w:t>
+      </w:r>
+      <w:proofErr w:type="spellEnd"/>
       <w:r>
         <w:rPr>
           <w:color w:val="000000"/>
           <w:sz w:val="20"/>
           <w:szCs w:val="20"/>
         </w:rPr>
-        <w:t>preferred non-invasive method for diagnosing such plantar thermal patterns in a reliable manner [2]-[4], [14].</w:t>
-      </w:r>
-    </w:p>
-    <w:p>
-      <w:pPr>
-        <w:pStyle w:val="NormalWeb"/>
-        <w:spacing w:before="12pt" w:beforeAutospacing="0" w:after="12pt" w:afterAutospacing="0"/>
-        <w:jc w:val="both"/>
+        <w:t>. Recent works used machine learning based tools to find ulcers early and found good results [7], [8]. Feature engineered indices like Thermal Change Index (TCI) also found that structured thermal descriptors help in identifying diabetic conditions early and are also useful for understanding and identifying symptoms of upcoming neuropathy and ulcer related complications [6]</w:t>
+      </w:r>
+      <w:r>
         <w:rPr>
           <w:color w:val="000000"/>
           <w:sz w:val="20"/>
           <w:szCs w:val="20"/>
         </w:rPr>
-      </w:pPr>
-      <w:r>
+        <w:t>.</w:t>
+      </w:r>
+    </w:p>
+    <w:p>
+      <w:pPr>
+        <w:pStyle w:val="NormalWeb"/>
+        <w:spacing w:before="12pt" w:beforeAutospacing="0" w:after="12pt" w:afterAutospacing="0"/>
+        <w:jc w:val="both"/>
         <w:rPr>
           <w:color w:val="000000"/>
           <w:sz w:val="20"/>
           <w:szCs w:val="20"/>
         </w:rPr>
-        <w:t xml:space="preserve">Manual temperature measurements or predefined difference thresholds are main aspects in current clinical </w:t>
-      </w:r>
-      <w:proofErr w:type="gramStart"/>
+      </w:pPr>
       <w:r>
         <w:rPr>
           <w:color w:val="000000"/>
           <w:sz w:val="20"/>
           <w:szCs w:val="20"/>
         </w:rPr>
-        <w:t>methods</w:t>
-      </w:r>
-      <w:proofErr w:type="gramEnd"/>
-      <w:r>
+        <w:t>Many limitations are present in existing studies like many approaches focus on binary ulcer detection rather than graded neuropathy risk stratification and others depend on clinically calibrated temperature thresholds or require specialized hardware configurations. So, there is a need for frameworks capable of stratifying neuropathy risk using thermographic data and help clinicians and patients understand about their diabetic condition in a better way.</w:t>
+      </w:r>
+    </w:p>
+    <w:p>
+      <w:pPr>
+        <w:pStyle w:val="NormalWeb"/>
+        <w:spacing w:before="12pt" w:after="12pt"/>
+        <w:jc w:val="both"/>
         <w:rPr>
           <w:color w:val="000000"/>
           <w:sz w:val="20"/>
           <w:szCs w:val="20"/>
         </w:rPr>
-        <w:t xml:space="preserve"> but these methods might not help fully understand complicated thermal distributions within thermograms that indicate </w:t>
-      </w:r>
-      <w:proofErr w:type="spellStart"/>
+      </w:pPr>
       <w:r>
         <w:rPr>
           <w:color w:val="000000"/>
           <w:sz w:val="20"/>
           <w:szCs w:val="20"/>
         </w:rPr>
-        <w:t>neuroapthy</w:t>
-      </w:r>
-      <w:proofErr w:type="spellEnd"/>
+        <w:t xml:space="preserve">In our work, we present a data-driven Thermal Risk Score (TRS) framework for diabetic neuropathy stratification using plantar thermogram images, </w:t>
+      </w:r>
       <w:r>
         <w:rPr>
           <w:color w:val="000000"/>
           <w:sz w:val="20"/>
           <w:szCs w:val="20"/>
         </w:rPr>
-        <w:t>. Recent works used machine learning based tools to find ulcers early and found good results [7], [8]. Feature engineered indices like Thermal Change Index (TCI) also found that structured thermal descriptors help in identifying diabetic conditions early and are also useful for understanding and identifying symptoms of upcoming neuropathy and ulcer related complications [6]</w:t>
+        <w:t>where Thermal</w:t>
       </w:r>
       <w:r>
         <w:rPr>
@@ -969,55 +971,55 @@
           <w:sz w:val="20"/>
           <w:szCs w:val="20"/>
         </w:rPr>
-        <w:t>.</w:t>
-      </w:r>
-    </w:p>
-    <w:p>
-      <w:pPr>
-        <w:pStyle w:val="NormalWeb"/>
-        <w:spacing w:before="12pt" w:beforeAutospacing="0" w:after="12pt" w:afterAutospacing="0"/>
-        <w:jc w:val="both"/>
+        <w:t xml:space="preserve"> Risk Score is formulated as a composite index using three key thermal quantities: global mean thermal intensity, temperature variability, and entropy-based texture complexity. </w:t>
+      </w:r>
+      <w:r>
         <w:rPr>
           <w:color w:val="000000"/>
           <w:sz w:val="20"/>
           <w:szCs w:val="20"/>
         </w:rPr>
-      </w:pPr>
-      <w:r>
+        <w:t>Mean thermal intensity reflects overall temperature elevation associated with inflammatory activity and variability tells us about distribution of thermal values over the plantar surface. Entropy tells us about distributional irregularity. This helps us finding thermal patterns often observed in neuropathic situations and these features were inspired by thermographic asymmetry and feature-based analysis in previous studies [1], [2], [6].</w:t>
+      </w:r>
+    </w:p>
+    <w:p>
+      <w:pPr>
+        <w:pStyle w:val="NormalWeb"/>
+        <w:spacing w:before="12pt" w:after="12pt"/>
+        <w:jc w:val="both"/>
         <w:rPr>
           <w:color w:val="000000"/>
           <w:sz w:val="20"/>
           <w:szCs w:val="20"/>
         </w:rPr>
-        <w:t>Many limitations are present in existing studies like many approaches focus on binary ulcer detection rather than graded neuropathy risk stratification and others depend on clinically calibrated temperature thresholds or require specialized hardware configurations. So, there is a need for frameworks capable of stratifying neuropathy risk using thermographic data and help clinicians and patients understand about their diabetic condition in a better way.</w:t>
-      </w:r>
-    </w:p>
-    <w:p>
-      <w:pPr>
-        <w:pStyle w:val="NormalWeb"/>
-        <w:spacing w:before="12pt" w:after="12pt"/>
-        <w:jc w:val="both"/>
+      </w:pPr>
+      <w:r>
         <w:rPr>
           <w:color w:val="000000"/>
           <w:sz w:val="20"/>
           <w:szCs w:val="20"/>
         </w:rPr>
-      </w:pPr>
-      <w:r>
+        <w:t>In this work we are using unsupervised clustering through K-Means clustering to group subjects to three increasing risk categories which is different from methods used in clinical thresholding systems.</w:t>
+      </w:r>
+    </w:p>
+    <w:p>
+      <w:pPr>
+        <w:pStyle w:val="NormalWeb"/>
+        <w:spacing w:before="12pt" w:after="12pt"/>
+        <w:jc w:val="both"/>
         <w:rPr>
           <w:color w:val="000000"/>
           <w:sz w:val="20"/>
           <w:szCs w:val="20"/>
         </w:rPr>
-        <w:t xml:space="preserve">In our work, we present a data-driven Thermal Risk Score (TRS) framework for diabetic neuropathy stratification using plantar thermogram images, </w:t>
-      </w:r>
+      </w:pPr>
       <w:r>
         <w:rPr>
           <w:color w:val="000000"/>
           <w:sz w:val="20"/>
           <w:szCs w:val="20"/>
         </w:rPr>
-        <w:t>where Thermal</w:t>
+        <w:t>This helps adjust system for diagnosis of the same depending on demography of a region. This framework remains lightweight and is suitable for medical screening applications</w:t>
       </w:r>
       <w:r>
         <w:rPr>
@@ -1025,7 +1027,7 @@
           <w:sz w:val="20"/>
           <w:szCs w:val="20"/>
         </w:rPr>
-        <w:t xml:space="preserve"> Risk Score is formulated as a composite index using three key thermal quantities: global mean thermal intensity, temperature variability, and entropy-based texture complexity. </w:t>
+        <w:t>.</w:t>
       </w:r>
       <w:r>
         <w:rPr>
@@ -1033,98 +1035,6 @@
           <w:sz w:val="20"/>
           <w:szCs w:val="20"/>
         </w:rPr>
-        <w:t xml:space="preserve">Mean thermal intensity reflects overall temperature elevation associated with inflammatory activity and variability tells us about distribution of thermal values over the plantar surface. Entropy tells us about distributional irregularity. This helps us </w:t>
-      </w:r>
-      <w:proofErr w:type="gramStart"/>
-      <w:r>
-        <w:rPr>
-          <w:color w:val="000000"/>
-          <w:sz w:val="20"/>
-          <w:szCs w:val="20"/>
-        </w:rPr>
-        <w:t>finding</w:t>
-      </w:r>
-      <w:proofErr w:type="gramEnd"/>
-      <w:r>
-        <w:rPr>
-          <w:color w:val="000000"/>
-          <w:sz w:val="20"/>
-          <w:szCs w:val="20"/>
-        </w:rPr>
-        <w:t xml:space="preserve"> thermal patterns often observed in neuropathic situations and these features were inspired by thermographic asymmetry and feature-based analysis in previous studies [1], [2], [6].</w:t>
-      </w:r>
-    </w:p>
-    <w:p>
-      <w:pPr>
-        <w:pStyle w:val="NormalWeb"/>
-        <w:spacing w:before="12pt" w:after="12pt"/>
-        <w:jc w:val="both"/>
-        <w:rPr>
-          <w:color w:val="000000"/>
-          <w:sz w:val="20"/>
-          <w:szCs w:val="20"/>
-        </w:rPr>
-      </w:pPr>
-      <w:r>
-        <w:rPr>
-          <w:color w:val="000000"/>
-          <w:sz w:val="20"/>
-          <w:szCs w:val="20"/>
-        </w:rPr>
-        <w:t xml:space="preserve">In this work we are using unsupervised clustering through K-Means clustering to group subjects </w:t>
-      </w:r>
-      <w:proofErr w:type="gramStart"/>
-      <w:r>
-        <w:rPr>
-          <w:color w:val="000000"/>
-          <w:sz w:val="20"/>
-          <w:szCs w:val="20"/>
-        </w:rPr>
-        <w:t>to</w:t>
-      </w:r>
-      <w:proofErr w:type="gramEnd"/>
-      <w:r>
-        <w:rPr>
-          <w:color w:val="000000"/>
-          <w:sz w:val="20"/>
-          <w:szCs w:val="20"/>
-        </w:rPr>
-        <w:t xml:space="preserve"> three increasing risk categories which is different from methods used in clinical thresholding systems.</w:t>
-      </w:r>
-    </w:p>
-    <w:p>
-      <w:pPr>
-        <w:pStyle w:val="NormalWeb"/>
-        <w:spacing w:before="12pt" w:after="12pt"/>
-        <w:jc w:val="both"/>
-        <w:rPr>
-          <w:color w:val="000000"/>
-          <w:sz w:val="20"/>
-          <w:szCs w:val="20"/>
-        </w:rPr>
-      </w:pPr>
-      <w:r>
-        <w:rPr>
-          <w:color w:val="000000"/>
-          <w:sz w:val="20"/>
-          <w:szCs w:val="20"/>
-        </w:rPr>
-        <w:t>This helps adjust system for diagnosis of the same depending on demography of a region. This framework remains lightweight and is suitable for medical screening applications</w:t>
-      </w:r>
-      <w:r>
-        <w:rPr>
-          <w:color w:val="000000"/>
-          <w:sz w:val="20"/>
-          <w:szCs w:val="20"/>
-        </w:rPr>
-        <w:t>.</w:t>
-      </w:r>
-      <w:r>
-        <w:rPr>
-          <w:color w:val="000000"/>
-          <w:sz w:val="20"/>
-          <w:szCs w:val="20"/>
-        </w:rPr>
         <w:t xml:space="preserve"> Established machine learning methods and augmentation methods were used to improve robustness and generalization [9]-[11].</w:t>
       </w:r>
     </w:p>
@@ -1178,12 +1088,10 @@
         <w:t xml:space="preserve">We preferred thermographic imaging as the input for our work because </w:t>
       </w:r>
       <w:proofErr w:type="spellStart"/>
-      <w:proofErr w:type="gramStart"/>
       <w:r>
         <w:t>its</w:t>
       </w:r>
       <w:proofErr w:type="spellEnd"/>
-      <w:proofErr w:type="gramEnd"/>
       <w:r>
         <w:t xml:space="preserve"> an easy, contactless and economic method to assess diabetic foot as compared to other methods for the same. </w:t>
       </w:r>
@@ -1275,15 +1183,7 @@
         <w:jc w:val="both"/>
       </w:pPr>
       <w:r>
-        <w:t xml:space="preserve">Also, current studies have limitations like many thermography-based </w:t>
-      </w:r>
-      <w:proofErr w:type="gramStart"/>
-      <w:r>
-        <w:t>method</w:t>
-      </w:r>
-      <w:proofErr w:type="gramEnd"/>
-      <w:r>
-        <w:t xml:space="preserve"> do just ulcer detection but not measuring probable neuropathy risk. Clinically calibrated temperature thresholds are used in some systems that may not generalize in all acquisition methods. </w:t>
+        <w:t xml:space="preserve">Also, current studies have limitations like many thermography-based method do just ulcer detection but not measuring probable neuropathy risk. Clinically calibrated temperature thresholds are used in some systems that may not generalize in all acquisition methods. </w:t>
       </w:r>
     </w:p>
     <w:p>
@@ -1312,15 +1212,7 @@
         <w:jc w:val="both"/>
       </w:pPr>
       <w:r>
-        <w:t>In deep learning-based approaches, we usually have less understanding on what features contribute to different indicators of diabetic foot problems. Systems that combine many features together</w:t>
-      </w:r>
-      <w:proofErr w:type="gramStart"/>
-      <w:r>
-        <w:t>, they</w:t>
-      </w:r>
-      <w:proofErr w:type="gramEnd"/>
-      <w:r>
-        <w:t xml:space="preserve"> help us interpret these features in a better way. </w:t>
+        <w:t xml:space="preserve">In deep learning-based approaches, we usually have less understanding on what features contribute to different indicators of diabetic foot problems. Systems that combine many features together, they help us interpret these features in a better way. </w:t>
       </w:r>
     </w:p>
     <w:p>
@@ -1494,53 +1386,24 @@
         <w:t xml:space="preserve">Only thermographic image data were used. No </w:t>
       </w:r>
       <w:r>
-        <w:t xml:space="preserve">clinical metadata </w:t>
-      </w:r>
-      <w:proofErr w:type="gramStart"/>
-      <w:r>
-        <w:t>were</w:t>
-      </w:r>
-      <w:proofErr w:type="gramEnd"/>
-      <w:r>
-        <w:t xml:space="preserve"> used.</w:t>
-      </w:r>
-    </w:p>
-    <w:p>
-      <w:pPr>
-        <w:jc w:val="both"/>
-      </w:pPr>
-    </w:p>
-    <w:p>
-      <w:pPr>
-        <w:jc w:val="both"/>
-      </w:pPr>
-    </w:p>
-    <w:p>
-      <w:pPr>
-        <w:jc w:val="both"/>
-        <w:rPr>
-          <w:b/>
-          <w:bCs/>
-        </w:rPr>
-      </w:pPr>
-      <w:r>
-        <w:rPr>
-          <w:b/>
-          <w:bCs/>
-        </w:rPr>
-        <w:t xml:space="preserve">            </w:t>
-      </w:r>
-      <w:r>
-        <w:rPr>
-          <w:b/>
-          <w:bCs/>
+        <w:t>clinical metadata were used.</w:t>
+      </w:r>
+    </w:p>
+    <w:p>
+      <w:pPr>
+        <w:jc w:val="both"/>
+      </w:pPr>
+    </w:p>
+    <w:p>
+      <w:r>
+        <w:rPr>
           <w:noProof/>
         </w:rPr>
         <w:drawing>
-          <wp:inline distT="0" distB="0" distL="0" distR="0" wp14:anchorId="7981B4BC" wp14:editId="102DAF0A">
-            <wp:extent cx="703308" cy="1373505"/>
-            <wp:effectExtent l="0" t="0" r="1905" b="0"/>
-            <wp:docPr id="1294711396" name="Picture 17"/>
+          <wp:inline distT="0" distB="0" distL="0" distR="0" wp14:anchorId="7A850BDD" wp14:editId="17213643">
+            <wp:extent cx="560506" cy="908957"/>
+            <wp:effectExtent l="0" t="0" r="0" b="5715"/>
+            <wp:docPr id="635688613" name="Picture 1"/>
             <wp:cNvGraphicFramePr>
               <a:graphicFrameLocks xmlns:a="http://purl.oclc.org/ooxml/drawingml/main" noChangeAspect="1"/>
             </wp:cNvGraphicFramePr>
@@ -1548,7 +1411,7 @@
               <a:graphicData uri="http://purl.oclc.org/ooxml/drawingml/picture">
                 <pic:pic xmlns:pic="http://purl.oclc.org/ooxml/drawingml/picture">
                   <pic:nvPicPr>
-                    <pic:cNvPr id="0" name="Picture 61"/>
+                    <pic:cNvPr id="0" name="Picture 1"/>
                     <pic:cNvPicPr>
                       <a:picLocks noChangeAspect="1" noChangeArrowheads="1"/>
                     </pic:cNvPicPr>
@@ -1569,7 +1432,7 @@
                   <pic:spPr bwMode="auto">
                     <a:xfrm>
                       <a:off x="0" y="0"/>
-                      <a:ext cx="711714" cy="1389922"/>
+                      <a:ext cx="561809" cy="911070"/>
                     </a:xfrm>
                     <a:prstGeom prst="rect">
                       <a:avLst/>
@@ -1586,37 +1449,17 @@
         </w:drawing>
       </w:r>
       <w:r>
-        <w:rPr>
-          <w:b/>
-          <w:bCs/>
-        </w:rPr>
-        <w:t xml:space="preserve">    </w:t>
-      </w:r>
-      <w:r>
-        <w:rPr>
-          <w:b/>
-          <w:bCs/>
-        </w:rPr>
-        <w:t xml:space="preserve">                    </w:t>
-      </w:r>
-      <w:r>
-        <w:rPr>
-          <w:b/>
-          <w:bCs/>
-        </w:rPr>
-        <w:t xml:space="preserve">   </w:t>
-      </w:r>
-      <w:r>
-        <w:rPr>
-          <w:b/>
-          <w:bCs/>
+        <w:t xml:space="preserve">       </w:t>
+      </w:r>
+      <w:r>
+        <w:rPr>
           <w:noProof/>
         </w:rPr>
         <w:drawing>
-          <wp:inline distT="0" distB="0" distL="0" distR="0" wp14:anchorId="7FFF89E7" wp14:editId="411C9D1B">
-            <wp:extent cx="712707" cy="1379019"/>
-            <wp:effectExtent l="0" t="0" r="0" b="0"/>
-            <wp:docPr id="675460545" name="Picture 16"/>
+          <wp:inline distT="0" distB="0" distL="0" distR="0" wp14:anchorId="35131980" wp14:editId="3FAE176F">
+            <wp:extent cx="554355" cy="914399"/>
+            <wp:effectExtent l="0" t="0" r="0" b="635"/>
+            <wp:docPr id="152998611" name="Picture 4"/>
             <wp:cNvGraphicFramePr>
               <a:graphicFrameLocks xmlns:a="http://purl.oclc.org/ooxml/drawingml/main" noChangeAspect="1"/>
             </wp:cNvGraphicFramePr>
@@ -1624,7 +1467,7 @@
               <a:graphicData uri="http://purl.oclc.org/ooxml/drawingml/picture">
                 <pic:pic xmlns:pic="http://purl.oclc.org/ooxml/drawingml/picture">
                   <pic:nvPicPr>
-                    <pic:cNvPr id="0" name="Picture 62"/>
+                    <pic:cNvPr id="0" name="Picture 10"/>
                     <pic:cNvPicPr>
                       <a:picLocks noChangeAspect="1" noChangeArrowheads="1"/>
                     </pic:cNvPicPr>
@@ -1645,7 +1488,7 @@
                   <pic:spPr bwMode="auto">
                     <a:xfrm>
                       <a:off x="0" y="0"/>
-                      <a:ext cx="714277" cy="1382056"/>
+                      <a:ext cx="561836" cy="926739"/>
                     </a:xfrm>
                     <a:prstGeom prst="rect">
                       <a:avLst/>
@@ -1661,6 +1504,101 @@
           </wp:inline>
         </w:drawing>
       </w:r>
+      <w:r>
+        <w:t xml:space="preserve">       </w:t>
+      </w:r>
+      <w:r>
+        <w:rPr>
+          <w:noProof/>
+        </w:rPr>
+        <w:drawing>
+          <wp:inline distT="0" distB="0" distL="0" distR="0" wp14:anchorId="22D1B5F3" wp14:editId="2954BCB0">
+            <wp:extent cx="560615" cy="911225"/>
+            <wp:effectExtent l="0" t="0" r="0" b="3175"/>
+            <wp:docPr id="175892593" name="Picture 7"/>
+            <wp:cNvGraphicFramePr>
+              <a:graphicFrameLocks xmlns:a="http://purl.oclc.org/ooxml/drawingml/main" noChangeAspect="1"/>
+            </wp:cNvGraphicFramePr>
+            <a:graphic xmlns:a="http://purl.oclc.org/ooxml/drawingml/main">
+              <a:graphicData uri="http://purl.oclc.org/ooxml/drawingml/picture">
+                <pic:pic xmlns:pic="http://purl.oclc.org/ooxml/drawingml/picture">
+                  <pic:nvPicPr>
+                    <pic:cNvPr id="0" name="Picture 16"/>
+                    <pic:cNvPicPr>
+                      <a:picLocks noChangeAspect="1" noChangeArrowheads="1"/>
+                    </pic:cNvPicPr>
+                  </pic:nvPicPr>
+                  <pic:blipFill>
+                    <a:blip r:embed="rId11">
+                      <a:extLst>
+                        <a:ext uri="{28A0092B-C50C-407E-A947-70E740481C1C}">
+                          <a14:useLocalDpi xmlns:a14="http://schemas.microsoft.com/office/drawing/2010/main" val="0"/>
+                        </a:ext>
+                      </a:extLst>
+                    </a:blip>
+                    <a:srcRect/>
+                    <a:stretch>
+                      <a:fillRect/>
+                    </a:stretch>
+                  </pic:blipFill>
+                  <pic:spPr bwMode="auto">
+                    <a:xfrm>
+                      <a:off x="0" y="0"/>
+                      <a:ext cx="587689" cy="955232"/>
+                    </a:xfrm>
+                    <a:prstGeom prst="rect">
+                      <a:avLst/>
+                    </a:prstGeom>
+                    <a:noFill/>
+                    <a:ln>
+                      <a:noFill/>
+                    </a:ln>
+                  </pic:spPr>
+                </pic:pic>
+              </a:graphicData>
+            </a:graphic>
+          </wp:inline>
+        </w:drawing>
+      </w:r>
+    </w:p>
+    <w:p>
+      <w:pPr>
+        <w:rPr>
+          <w:sz w:val="16"/>
+          <w:szCs w:val="16"/>
+        </w:rPr>
+      </w:pPr>
+    </w:p>
+    <w:p>
+      <w:pPr>
+        <w:jc w:val="both"/>
+        <w:rPr>
+          <w:sz w:val="16"/>
+          <w:szCs w:val="16"/>
+        </w:rPr>
+      </w:pPr>
+      <w:r>
+        <w:tab/>
+        <w:t xml:space="preserve">        </w:t>
+      </w:r>
+      <w:r>
+        <w:rPr>
+          <w:sz w:val="16"/>
+          <w:szCs w:val="16"/>
+        </w:rPr>
+        <w:t xml:space="preserve">(a) </w:t>
+      </w:r>
+      <w:r>
+        <w:tab/>
+        <w:t xml:space="preserve">                  </w:t>
+      </w:r>
+      <w:r>
+        <w:rPr>
+          <w:sz w:val="16"/>
+          <w:szCs w:val="16"/>
+        </w:rPr>
+        <w:t>(b)                          (c)</w:t>
+      </w:r>
     </w:p>
     <w:p>
       <w:pPr>
@@ -1695,7 +1633,70 @@
           <w:sz w:val="16"/>
           <w:szCs w:val="16"/>
         </w:rPr>
-        <w:t>Samples from Augmented Dataset (a) Normal Foot (b) Diabetic Foot</w:t>
+        <w:t xml:space="preserve">Samples from </w:t>
+      </w:r>
+      <w:r>
+        <w:rPr>
+          <w:sz w:val="16"/>
+          <w:szCs w:val="16"/>
+        </w:rPr>
+        <w:t>a</w:t>
+      </w:r>
+      <w:r>
+        <w:rPr>
+          <w:sz w:val="16"/>
+          <w:szCs w:val="16"/>
+        </w:rPr>
+        <w:t xml:space="preserve">ugmented </w:t>
+      </w:r>
+      <w:r>
+        <w:rPr>
+          <w:sz w:val="16"/>
+          <w:szCs w:val="16"/>
+        </w:rPr>
+        <w:t>d</w:t>
+      </w:r>
+      <w:r>
+        <w:rPr>
+          <w:sz w:val="16"/>
+          <w:szCs w:val="16"/>
+        </w:rPr>
+        <w:t>ataset</w:t>
+      </w:r>
+      <w:r>
+        <w:rPr>
+          <w:sz w:val="16"/>
+          <w:szCs w:val="16"/>
+        </w:rPr>
+        <w:t xml:space="preserve"> corresponding to neuropathic risk</w:t>
+      </w:r>
+      <w:r>
+        <w:rPr>
+          <w:sz w:val="16"/>
+          <w:szCs w:val="16"/>
+        </w:rPr>
+        <w:t xml:space="preserve"> (a) </w:t>
+      </w:r>
+      <w:r>
+        <w:rPr>
+          <w:sz w:val="16"/>
+          <w:szCs w:val="16"/>
+        </w:rPr>
+        <w:t xml:space="preserve">Low risk </w:t>
+      </w:r>
+      <w:r>
+        <w:rPr>
+          <w:sz w:val="16"/>
+          <w:szCs w:val="16"/>
+        </w:rPr>
+        <w:t xml:space="preserve">(b) </w:t>
+      </w:r>
+      <w:r>
+        <w:rPr>
+          <w:sz w:val="16"/>
+          <w:szCs w:val="16"/>
+        </w:rPr>
+        <w:t>Medium risk (c) High risk foot images</w:t>
       </w:r>
     </w:p>
     <w:p>
@@ -1712,7 +1713,6 @@
           <w:b/>
           <w:bCs/>
         </w:rPr>
-        <w:lastRenderedPageBreak/>
         <w:t xml:space="preserve">B. Overall </w:t>
       </w:r>
       <w:r>
@@ -1735,7 +1735,11 @@
         <w:jc w:val="both"/>
       </w:pPr>
       <w:r>
-        <w:t xml:space="preserve">The proposed system follows a multi-stage hybrid framework combining deep learning and interpretable thermographic modeling. The pipeline consists of Image preprocessing and augmentation, CNN-based deep feature learning, Statistical thermal feature extraction, Feature fusion, </w:t>
+        <w:t xml:space="preserve">The proposed system follows a multi-stage hybrid framework combining deep learning and interpretable thermographic </w:t>
+      </w:r>
+      <w:r>
+        <w:lastRenderedPageBreak/>
+        <w:t xml:space="preserve">modeling. The pipeline consists of Image preprocessing and augmentation, CNN-based deep feature learning, Statistical thermal feature extraction, Feature fusion, </w:t>
       </w:r>
       <w:proofErr w:type="spellStart"/>
       <w:r>
@@ -1790,7 +1794,7 @@
                     <pic:cNvPicPr/>
                   </pic:nvPicPr>
                   <pic:blipFill>
-                    <a:blip r:embed="rId11"/>
+                    <a:blip r:embed="rId12"/>
                     <a:stretch>
                       <a:fillRect/>
                     </a:stretch>
@@ -1968,7 +1972,7 @@
                     <pic:cNvPicPr/>
                   </pic:nvPicPr>
                   <pic:blipFill>
-                    <a:blip r:embed="rId12"/>
+                    <a:blip r:embed="rId13"/>
                     <a:stretch>
                       <a:fillRect/>
                     </a:stretch>
@@ -2063,7 +2067,10 @@
         <w:t>images</w:t>
       </w:r>
       <w:r>
-        <w:t xml:space="preserve">. Using OpenCV transformations, </w:t>
+        <w:t xml:space="preserve">. Using OpenCV </w:t>
+      </w:r>
+      <w:r>
+        <w:t xml:space="preserve">transformations, </w:t>
       </w:r>
       <w:r>
         <w:t>descriptors</w:t>
@@ -2135,17 +2142,16 @@
     <w:p>
       <w:pPr>
         <w:jc w:val="both"/>
-      </w:pPr>
-      <w:r>
-        <w:t xml:space="preserve">A hybrid feature vector was </w:t>
-      </w:r>
-      <w:proofErr w:type="gramStart"/>
-      <w:r>
-        <w:t>made out of</w:t>
-      </w:r>
-      <w:proofErr w:type="gramEnd"/>
-      <w:r>
-        <w:t xml:space="preserve"> features given by CNN and manually engineered thermal features by concatenating them together and a </w:t>
+        <w:rPr>
+          <w:rFonts w:ascii="Arial" w:hAnsi="Arial" w:cs="Arial"/>
+          <w:color w:val="3B3A3B"/>
+          <w:spacing w:val="5"/>
+          <w:sz w:val="21"/>
+          <w:szCs w:val="21"/>
+        </w:rPr>
+      </w:pPr>
+      <w:r>
+        <w:t xml:space="preserve">A hybrid feature vector was made out of features given by CNN and manually engineered thermal features by concatenating them together and a </w:t>
       </w:r>
       <w:proofErr w:type="spellStart"/>
       <w:r>
@@ -2155,108 +2161,831 @@
       <w:r>
         <w:t xml:space="preserve"> classifier model was trained on this hybrid feature vector for predicting neuropathic risk.</w:t>
       </w:r>
-    </w:p>
-    <w:p>
-      <w:pPr>
-        <w:jc w:val="both"/>
-      </w:pPr>
-    </w:p>
-    <w:p>
-      <w:pPr>
-        <w:jc w:val="both"/>
-        <w:rPr>
-          <w:b/>
-          <w:bCs/>
-        </w:rPr>
-      </w:pPr>
-      <w:r>
-        <w:rPr>
-          <w:b/>
-          <w:bCs/>
-        </w:rPr>
-        <w:t>G. Thermal Risk Score (TRS) Formulation</w:t>
-      </w:r>
-    </w:p>
-    <w:p>
-      <w:pPr>
-        <w:jc w:val="both"/>
-      </w:pPr>
-      <w:r>
-        <w:t>The Thermal Risk Score (TRS) is calculated by using a weighted equation of the mean, standard deviation, and entropy of the thermograms as follows:</w:t>
-      </w:r>
-    </w:p>
-    <w:p>
-      <w:pPr>
-        <w:jc w:val="both"/>
-      </w:pPr>
-    </w:p>
-    <w:p>
-      <w:pPr>
-        <w:jc w:val="both"/>
-      </w:pPr>
-      <m:oMathPara>
-        <m:oMath>
-          <m:m>
-            <m:mPr>
-              <m:plcHide m:val="1"/>
-              <m:mcs>
-                <m:mc>
-                  <m:mcPr>
-                    <m:count m:val="4"/>
-                    <m:mcJc m:val="center"/>
-                  </m:mcPr>
-                </m:mc>
-              </m:mcs>
-              <m:ctrlPr>
-                <w:rPr>
-                  <w:rFonts w:ascii="Cambria Math" w:hAnsi="Cambria Math"/>
-                </w:rPr>
-              </m:ctrlPr>
-            </m:mPr>
-            <m:mr>
-              <m:e/>
+      <w:r>
+        <w:rPr>
+          <w:rFonts w:ascii="Arial" w:hAnsi="Arial" w:cs="Arial"/>
+          <w:color w:val="3B3A3B"/>
+          <w:spacing w:val="5"/>
+          <w:sz w:val="21"/>
+          <w:szCs w:val="21"/>
+        </w:rPr>
+        <w:t xml:space="preserve"> </w:t>
+      </w:r>
+    </w:p>
+    <w:p>
+      <w:pPr>
+        <w:jc w:val="both"/>
+      </w:pPr>
+      <w:r>
+        <w:t xml:space="preserve">At each iteration, the </w:t>
+      </w:r>
+      <w:proofErr w:type="spellStart"/>
+      <w:r>
+        <w:t>XGBoost</w:t>
+      </w:r>
+      <w:proofErr w:type="spellEnd"/>
+      <w:r>
+        <w:t xml:space="preserve"> model minimizes following regularized objective function:</w:t>
+      </w:r>
+    </w:p>
+    <w:p>
+      <w:pPr>
+        <w:jc w:val="both"/>
+      </w:pPr>
+    </w:p>
+    <w:p>
+      <w:pPr>
+        <w:jc w:val="both"/>
+      </w:pPr>
+      <m:oMath>
+        <m:sSup>
+          <m:sSupPr>
+            <m:ctrlPr>
+              <w:rPr>
+                <w:rFonts w:ascii="Cambria Math" w:hAnsi="Cambria Math"/>
+                <w:i/>
+              </w:rPr>
+            </m:ctrlPr>
+          </m:sSupPr>
+          <m:e>
+            <m:r>
+              <w:rPr>
+                <w:rFonts w:ascii="Cambria Math" w:hAnsi="Cambria Math"/>
+              </w:rPr>
+              <m:t>L</m:t>
+            </m:r>
+          </m:e>
+          <m:sup>
+            <m:d>
+              <m:dPr>
+                <m:ctrlPr>
+                  <w:rPr>
+                    <w:rFonts w:ascii="Cambria Math" w:hAnsi="Cambria Math"/>
+                    <w:i/>
+                  </w:rPr>
+                </m:ctrlPr>
+              </m:dPr>
               <m:e>
-                <m:r>
-                  <m:rPr>
-                    <m:nor/>
-                  </m:rPr>
-                  <m:t>TRS</m:t>
-                </m:r>
                 <m:r>
                   <w:rPr>
                     <w:rFonts w:ascii="Cambria Math" w:hAnsi="Cambria Math"/>
                   </w:rPr>
-                  <m:t>=0.4⋅μ+0.3⋅σ+0.3⋅H</m:t>
+                  <m:t>t</m:t>
                 </m:r>
               </m:e>
-              <m:e/>
+            </m:d>
+          </m:sup>
+        </m:sSup>
+        <m:r>
+          <w:rPr>
+            <w:rFonts w:ascii="Cambria Math" w:hAnsi="Cambria Math"/>
+          </w:rPr>
+          <m:t>=</m:t>
+        </m:r>
+        <m:nary>
+          <m:naryPr>
+            <m:chr m:val="∑"/>
+            <m:ctrlPr>
+              <w:rPr>
+                <w:rFonts w:ascii="Cambria Math" w:hAnsi="Cambria Math"/>
+                <w:i/>
+              </w:rPr>
+            </m:ctrlPr>
+          </m:naryPr>
+          <m:sub>
+            <m:r>
+              <w:rPr>
+                <w:rFonts w:ascii="Cambria Math" w:hAnsi="Cambria Math"/>
+              </w:rPr>
+              <m:t>i=1</m:t>
+            </m:r>
+          </m:sub>
+          <m:sup>
+            <m:r>
+              <w:rPr>
+                <w:rFonts w:ascii="Cambria Math" w:hAnsi="Cambria Math"/>
+              </w:rPr>
+              <m:t>n</m:t>
+            </m:r>
+          </m:sup>
+          <m:e>
+            <m:r>
+              <w:rPr>
+                <w:rFonts w:ascii="Cambria Math" w:hAnsi="Cambria Math"/>
+              </w:rPr>
+              <m:t>l</m:t>
+            </m:r>
+            <m:d>
+              <m:dPr>
+                <m:ctrlPr>
+                  <w:rPr>
+                    <w:rFonts w:ascii="Cambria Math" w:hAnsi="Cambria Math"/>
+                    <w:i/>
+                  </w:rPr>
+                </m:ctrlPr>
+              </m:dPr>
+              <m:e>
+                <m:sSub>
+                  <m:sSubPr>
+                    <m:ctrlPr>
+                      <w:rPr>
+                        <w:rFonts w:ascii="Cambria Math" w:hAnsi="Cambria Math"/>
+                        <w:i/>
+                      </w:rPr>
+                    </m:ctrlPr>
+                  </m:sSubPr>
+                  <m:e>
+                    <m:r>
+                      <w:rPr>
+                        <w:rFonts w:ascii="Cambria Math" w:hAnsi="Cambria Math"/>
+                      </w:rPr>
+                      <m:t>y</m:t>
+                    </m:r>
+                  </m:e>
+                  <m:sub>
+                    <m:r>
+                      <w:rPr>
+                        <w:rFonts w:ascii="Cambria Math" w:hAnsi="Cambria Math"/>
+                      </w:rPr>
+                      <m:t>i</m:t>
+                    </m:r>
+                  </m:sub>
+                </m:sSub>
+                <m:r>
+                  <w:rPr>
+                    <w:rFonts w:ascii="Cambria Math" w:hAnsi="Cambria Math"/>
+                  </w:rPr>
+                  <m:t xml:space="preserve">, </m:t>
+                </m:r>
+                <m:acc>
+                  <m:accPr>
+                    <m:ctrlPr>
+                      <w:rPr>
+                        <w:rFonts w:ascii="Cambria Math" w:hAnsi="Cambria Math"/>
+                        <w:i/>
+                      </w:rPr>
+                    </m:ctrlPr>
+                  </m:accPr>
+                  <m:e>
+                    <m:sSubSup>
+                      <m:sSubSupPr>
+                        <m:ctrlPr>
+                          <w:rPr>
+                            <w:rFonts w:ascii="Cambria Math" w:hAnsi="Cambria Math"/>
+                            <w:i/>
+                          </w:rPr>
+                        </m:ctrlPr>
+                      </m:sSubSupPr>
+                      <m:e>
+                        <m:r>
+                          <w:rPr>
+                            <w:rFonts w:ascii="Cambria Math" w:hAnsi="Cambria Math"/>
+                          </w:rPr>
+                          <m:t xml:space="preserve"> </m:t>
+                        </m:r>
+                        <m:r>
+                          <w:rPr>
+                            <w:rFonts w:ascii="Cambria Math" w:hAnsi="Cambria Math"/>
+                          </w:rPr>
+                          <m:t>y</m:t>
+                        </m:r>
+                      </m:e>
+                      <m:sub>
+                        <m:r>
+                          <w:rPr>
+                            <w:rFonts w:ascii="Cambria Math" w:hAnsi="Cambria Math"/>
+                          </w:rPr>
+                          <m:t>i</m:t>
+                        </m:r>
+                      </m:sub>
+                      <m:sup>
+                        <m:d>
+                          <m:dPr>
+                            <m:ctrlPr>
+                              <w:rPr>
+                                <w:rFonts w:ascii="Cambria Math" w:hAnsi="Cambria Math"/>
+                                <w:i/>
+                              </w:rPr>
+                            </m:ctrlPr>
+                          </m:dPr>
+                          <m:e>
+                            <m:r>
+                              <w:rPr>
+                                <w:rFonts w:ascii="Cambria Math" w:hAnsi="Cambria Math"/>
+                              </w:rPr>
+                              <m:t>t-1</m:t>
+                            </m:r>
+                          </m:e>
+                        </m:d>
+                      </m:sup>
+                    </m:sSubSup>
+                  </m:e>
+                </m:acc>
+                <m:r>
+                  <w:rPr>
+                    <w:rFonts w:ascii="Cambria Math" w:hAnsi="Cambria Math"/>
+                  </w:rPr>
+                  <m:t xml:space="preserve">+ </m:t>
+                </m:r>
+                <m:sSub>
+                  <m:sSubPr>
+                    <m:ctrlPr>
+                      <w:rPr>
+                        <w:rFonts w:ascii="Cambria Math" w:hAnsi="Cambria Math"/>
+                        <w:i/>
+                      </w:rPr>
+                    </m:ctrlPr>
+                  </m:sSubPr>
+                  <m:e>
+                    <m:r>
+                      <w:rPr>
+                        <w:rFonts w:ascii="Cambria Math" w:hAnsi="Cambria Math"/>
+                      </w:rPr>
+                      <m:t>f</m:t>
+                    </m:r>
+                  </m:e>
+                  <m:sub>
+                    <m:r>
+                      <w:rPr>
+                        <w:rFonts w:ascii="Cambria Math" w:hAnsi="Cambria Math"/>
+                      </w:rPr>
+                      <m:t>t</m:t>
+                    </m:r>
+                    <m:d>
+                      <m:dPr>
+                        <m:ctrlPr>
+                          <w:rPr>
+                            <w:rFonts w:ascii="Cambria Math" w:hAnsi="Cambria Math"/>
+                            <w:i/>
+                          </w:rPr>
+                        </m:ctrlPr>
+                      </m:dPr>
+                      <m:e>
+                        <m:sSub>
+                          <m:sSubPr>
+                            <m:ctrlPr>
+                              <w:rPr>
+                                <w:rFonts w:ascii="Cambria Math" w:hAnsi="Cambria Math"/>
+                                <w:i/>
+                              </w:rPr>
+                            </m:ctrlPr>
+                          </m:sSubPr>
+                          <m:e>
+                            <m:r>
+                              <w:rPr>
+                                <w:rFonts w:ascii="Cambria Math" w:hAnsi="Cambria Math"/>
+                              </w:rPr>
+                              <m:t>x</m:t>
+                            </m:r>
+                          </m:e>
+                          <m:sub>
+                            <m:r>
+                              <w:rPr>
+                                <w:rFonts w:ascii="Cambria Math" w:hAnsi="Cambria Math"/>
+                              </w:rPr>
+                              <m:t>i</m:t>
+                            </m:r>
+                          </m:sub>
+                        </m:sSub>
+                      </m:e>
+                    </m:d>
+                  </m:sub>
+                </m:sSub>
+              </m:e>
+            </m:d>
+            <m:r>
+              <w:rPr>
+                <w:rFonts w:ascii="Cambria Math" w:hAnsi="Cambria Math"/>
+              </w:rPr>
+              <m:t xml:space="preserve">+ </m:t>
+            </m:r>
+            <m:r>
+              <w:rPr>
+                <w:rFonts w:ascii="Cambria Math" w:hAnsi="Cambria Math"/>
+              </w:rPr>
+              <m:t>Ω</m:t>
+            </m:r>
+            <m:d>
+              <m:dPr>
+                <m:ctrlPr>
+                  <w:rPr>
+                    <w:rFonts w:ascii="Cambria Math" w:hAnsi="Cambria Math"/>
+                    <w:i/>
+                  </w:rPr>
+                </m:ctrlPr>
+              </m:dPr>
+              <m:e>
+                <m:sSub>
+                  <m:sSubPr>
+                    <m:ctrlPr>
+                      <w:rPr>
+                        <w:rFonts w:ascii="Cambria Math" w:hAnsi="Cambria Math"/>
+                        <w:i/>
+                      </w:rPr>
+                    </m:ctrlPr>
+                  </m:sSubPr>
+                  <m:e>
+                    <m:r>
+                      <w:rPr>
+                        <w:rFonts w:ascii="Cambria Math" w:hAnsi="Cambria Math"/>
+                      </w:rPr>
+                      <m:t>f</m:t>
+                    </m:r>
+                  </m:e>
+                  <m:sub>
+                    <m:r>
+                      <w:rPr>
+                        <w:rFonts w:ascii="Cambria Math" w:hAnsi="Cambria Math"/>
+                      </w:rPr>
+                      <m:t>t</m:t>
+                    </m:r>
+                  </m:sub>
+                </m:sSub>
+              </m:e>
+            </m:d>
+          </m:e>
+        </m:nary>
+      </m:oMath>
+      <w:r>
+        <w:t xml:space="preserve">                      (1)</w:t>
+      </w:r>
+    </w:p>
+    <w:p>
+      <w:pPr>
+        <w:jc w:val="both"/>
+      </w:pPr>
+    </w:p>
+    <w:p>
+      <w:pPr>
+        <w:jc w:val="both"/>
+      </w:pPr>
+      <w:r>
+        <w:t xml:space="preserve">Here first term represents a differentiable convex loss function that measures the difference between the target and the prediction. </w:t>
+      </w:r>
+      <w:proofErr w:type="spellStart"/>
+      <w:r>
+        <w:t>XGBoost</w:t>
+      </w:r>
+      <w:proofErr w:type="spellEnd"/>
+      <w:r>
+        <w:t xml:space="preserve"> uses gradient, hessian of the loss function and second-order Taylor expansion, and optimizes wider range of objective functions other than standard squared error.</w:t>
+      </w:r>
+    </w:p>
+    <w:p>
+      <w:pPr>
+        <w:jc w:val="both"/>
+      </w:pPr>
+      <w:proofErr w:type="spellStart"/>
+      <w:r>
+        <w:t>XGBoost</w:t>
+      </w:r>
+      <w:proofErr w:type="spellEnd"/>
+      <w:r>
+        <w:t xml:space="preserve"> model includes explicit regularization, which penalizes model complexity to prevent overfitting. It is defined as:</w:t>
+      </w:r>
+    </w:p>
+    <w:p>
+      <w:pPr>
+        <w:jc w:val="both"/>
+      </w:pPr>
+    </w:p>
+    <w:p>
+      <w:pPr>
+        <w:jc w:val="both"/>
+      </w:pPr>
+      <m:oMath>
+        <m:r>
+          <w:rPr>
+            <w:rFonts w:ascii="Cambria Math" w:hAnsi="Cambria Math"/>
+          </w:rPr>
+          <m:t xml:space="preserve"> </m:t>
+        </m:r>
+        <m:r>
+          <w:rPr>
+            <w:rFonts w:ascii="Cambria Math" w:hAnsi="Cambria Math"/>
+          </w:rPr>
+          <m:t>Ω</m:t>
+        </m:r>
+        <m:d>
+          <m:dPr>
+            <m:ctrlPr>
+              <w:rPr>
+                <w:rFonts w:ascii="Cambria Math" w:hAnsi="Cambria Math"/>
+                <w:i/>
+              </w:rPr>
+            </m:ctrlPr>
+          </m:dPr>
+          <m:e>
+            <m:sSub>
+              <m:sSubPr>
+                <m:ctrlPr>
+                  <w:rPr>
+                    <w:rFonts w:ascii="Cambria Math" w:hAnsi="Cambria Math"/>
+                    <w:i/>
+                  </w:rPr>
+                </m:ctrlPr>
+              </m:sSubPr>
               <m:e>
                 <m:r>
-                  <m:rPr>
-                    <m:nor/>
-                  </m:rPr>
                   <w:rPr>
-                    <w:rFonts w:ascii="Cambria Math"/>
+                    <w:rFonts w:ascii="Cambria Math" w:hAnsi="Cambria Math"/>
                   </w:rPr>
-                  <m:t xml:space="preserve">                     </m:t>
-                </m:r>
-                <m:r>
-                  <m:rPr>
-                    <m:nor/>
-                  </m:rPr>
-                  <m:t>(1)</m:t>
+                  <m:t>f</m:t>
                 </m:r>
               </m:e>
-            </m:mr>
-          </m:m>
-          <m:r>
-            <m:rPr>
-              <m:sty m:val="p"/>
-            </m:rPr>
-            <w:br/>
-          </m:r>
-        </m:oMath>
-      </m:oMathPara>
+              <m:sub>
+                <m:r>
+                  <w:rPr>
+                    <w:rFonts w:ascii="Cambria Math" w:hAnsi="Cambria Math"/>
+                  </w:rPr>
+                  <m:t>t</m:t>
+                </m:r>
+              </m:sub>
+            </m:sSub>
+          </m:e>
+        </m:d>
+        <m:r>
+          <w:rPr>
+            <w:rFonts w:ascii="Cambria Math" w:hAnsi="Cambria Math"/>
+          </w:rPr>
+          <m:t>=</m:t>
+        </m:r>
+        <m:r>
+          <w:rPr>
+            <w:rFonts w:ascii="Cambria Math" w:hAnsi="Cambria Math"/>
+          </w:rPr>
+          <m:t>γT</m:t>
+        </m:r>
+        <m:r>
+          <w:rPr>
+            <w:rFonts w:ascii="Cambria Math" w:hAnsi="Cambria Math"/>
+          </w:rPr>
+          <m:t xml:space="preserve"> + </m:t>
+        </m:r>
+        <m:f>
+          <m:fPr>
+            <m:ctrlPr>
+              <w:rPr>
+                <w:rFonts w:ascii="Cambria Math" w:hAnsi="Cambria Math"/>
+                <w:i/>
+              </w:rPr>
+            </m:ctrlPr>
+          </m:fPr>
+          <m:num>
+            <m:r>
+              <w:rPr>
+                <w:rFonts w:ascii="Cambria Math" w:hAnsi="Cambria Math"/>
+              </w:rPr>
+              <m:t>1</m:t>
+            </m:r>
+          </m:num>
+          <m:den>
+            <m:r>
+              <w:rPr>
+                <w:rFonts w:ascii="Cambria Math" w:hAnsi="Cambria Math"/>
+              </w:rPr>
+              <m:t>2</m:t>
+            </m:r>
+          </m:den>
+        </m:f>
+        <m:r>
+          <w:rPr>
+            <w:rFonts w:ascii="Cambria Math" w:hAnsi="Cambria Math"/>
+          </w:rPr>
+          <m:t>λ</m:t>
+        </m:r>
+        <m:nary>
+          <m:naryPr>
+            <m:chr m:val="∑"/>
+            <m:ctrlPr>
+              <w:rPr>
+                <w:rFonts w:ascii="Cambria Math" w:hAnsi="Cambria Math"/>
+                <w:i/>
+              </w:rPr>
+            </m:ctrlPr>
+          </m:naryPr>
+          <m:sub>
+            <m:r>
+              <w:rPr>
+                <w:rFonts w:ascii="Cambria Math" w:hAnsi="Cambria Math"/>
+              </w:rPr>
+              <m:t>j=1</m:t>
+            </m:r>
+          </m:sub>
+          <m:sup>
+            <m:r>
+              <w:rPr>
+                <w:rFonts w:ascii="Cambria Math" w:hAnsi="Cambria Math"/>
+              </w:rPr>
+              <m:t>T</m:t>
+            </m:r>
+          </m:sup>
+          <m:e>
+            <m:sSubSup>
+              <m:sSubSupPr>
+                <m:ctrlPr>
+                  <w:rPr>
+                    <w:rFonts w:ascii="Cambria Math" w:hAnsi="Cambria Math"/>
+                    <w:i/>
+                  </w:rPr>
+                </m:ctrlPr>
+              </m:sSubSupPr>
+              <m:e>
+                <m:r>
+                  <w:rPr>
+                    <w:rFonts w:ascii="Cambria Math" w:hAnsi="Cambria Math"/>
+                  </w:rPr>
+                  <m:t>w</m:t>
+                </m:r>
+              </m:e>
+              <m:sub>
+                <m:r>
+                  <w:rPr>
+                    <w:rFonts w:ascii="Cambria Math" w:hAnsi="Cambria Math"/>
+                  </w:rPr>
+                  <m:t>j</m:t>
+                </m:r>
+              </m:sub>
+              <m:sup>
+                <m:r>
+                  <w:rPr>
+                    <w:rFonts w:ascii="Cambria Math" w:hAnsi="Cambria Math"/>
+                  </w:rPr>
+                  <m:t>2</m:t>
+                </m:r>
+              </m:sup>
+            </m:sSubSup>
+          </m:e>
+        </m:nary>
+      </m:oMath>
+      <w:r>
+        <w:t xml:space="preserve">                                               (2)     </w:t>
+      </w:r>
+    </w:p>
+    <w:p>
+      <w:pPr>
+        <w:jc w:val="both"/>
+      </w:pPr>
+    </w:p>
+    <w:p>
+      <w:pPr>
+        <w:jc w:val="both"/>
+      </w:pPr>
+      <w:r>
+        <w:t>This term consists of two components:</w:t>
+      </w:r>
+    </w:p>
+    <w:p>
+      <w:pPr>
+        <w:jc w:val="both"/>
+      </w:pPr>
+      <w:r>
+        <w:t>Leaf Penalty</w:t>
+      </w:r>
+      <w:r>
+        <w:t xml:space="preserve"> (</w:t>
+      </w:r>
+      <m:oMath>
+        <m:r>
+          <w:rPr>
+            <w:rFonts w:ascii="Cambria Math" w:hAnsi="Cambria Math"/>
+          </w:rPr>
+          <m:t>γT</m:t>
+        </m:r>
+        <m:r>
+          <w:rPr>
+            <w:rFonts w:ascii="Cambria Math" w:hAnsi="Cambria Math"/>
+          </w:rPr>
+          <m:t xml:space="preserve">) </m:t>
+        </m:r>
+      </m:oMath>
+      <w:r>
+        <w:t>: This term penalizes total number of leaves in tree and hence controls model complexity.</w:t>
+      </w:r>
+    </w:p>
+    <w:p>
+      <w:pPr>
+        <w:jc w:val="both"/>
+      </w:pPr>
+      <w:r>
+        <w:t>Weight Scaling</w:t>
+      </w:r>
+      <w:r>
+        <w:t xml:space="preserve"> </w:t>
+      </w:r>
+      <m:oMath>
+        <m:r>
+          <w:rPr>
+            <w:rFonts w:ascii="Cambria Math" w:hAnsi="Cambria Math"/>
+          </w:rPr>
+          <m:t>(</m:t>
+        </m:r>
+        <m:r>
+          <w:rPr>
+            <w:rFonts w:ascii="Cambria Math" w:hAnsi="Cambria Math"/>
+          </w:rPr>
+          <m:t>λ</m:t>
+        </m:r>
+        <m:r>
+          <w:rPr>
+            <w:rFonts w:ascii="Cambria Math" w:hAnsi="Cambria Math"/>
+          </w:rPr>
+          <m:t xml:space="preserve">) </m:t>
+        </m:r>
+      </m:oMath>
+      <w:r>
+        <w:t>:</w:t>
+      </w:r>
+      <w:r>
+        <w:t xml:space="preserve"> </w:t>
+      </w:r>
+      <w:r>
+        <w:t>This value keeps model more generalised and stable by smoothing out final learned weights with L2 regularisation.</w:t>
+      </w:r>
+    </w:p>
+    <w:p>
+      <w:pPr>
+        <w:jc w:val="both"/>
+      </w:pPr>
+      <w:r>
+        <w:t xml:space="preserve">                   </w:t>
+      </w:r>
+    </w:p>
+    <w:p>
+      <w:r>
+        <w:drawing>
+          <wp:inline distT="0" distB="0" distL="0" distR="0" wp14:anchorId="563CDEA9" wp14:editId="19FD599E">
+            <wp:extent cx="3089910" cy="1780540"/>
+            <wp:effectExtent l="0" t="0" r="0" b="0"/>
+            <wp:docPr id="1170978972" name="Picture 1"/>
+            <wp:cNvGraphicFramePr>
+              <a:graphicFrameLocks xmlns:a="http://purl.oclc.org/ooxml/drawingml/main" noChangeAspect="1"/>
+            </wp:cNvGraphicFramePr>
+            <a:graphic xmlns:a="http://purl.oclc.org/ooxml/drawingml/main">
+              <a:graphicData uri="http://purl.oclc.org/ooxml/drawingml/picture">
+                <pic:pic xmlns:pic="http://purl.oclc.org/ooxml/drawingml/picture">
+                  <pic:nvPicPr>
+                    <pic:cNvPr id="1170978972" name=""/>
+                    <pic:cNvPicPr/>
+                  </pic:nvPicPr>
+                  <pic:blipFill>
+                    <a:blip r:embed="rId14"/>
+                    <a:stretch>
+                      <a:fillRect/>
+                    </a:stretch>
+                  </pic:blipFill>
+                  <pic:spPr>
+                    <a:xfrm>
+                      <a:off x="0" y="0"/>
+                      <a:ext cx="3089910" cy="1780540"/>
+                    </a:xfrm>
+                    <a:prstGeom prst="rect">
+                      <a:avLst/>
+                    </a:prstGeom>
+                  </pic:spPr>
+                </pic:pic>
+              </a:graphicData>
+            </a:graphic>
+          </wp:inline>
+        </w:drawing>
+      </w:r>
+    </w:p>
+    <w:p/>
+    <w:p>
+      <w:pPr>
+        <w:rPr>
+          <w:sz w:val="16"/>
+          <w:szCs w:val="16"/>
+        </w:rPr>
+      </w:pPr>
+      <w:r>
+        <w:rPr>
+          <w:sz w:val="16"/>
+          <w:szCs w:val="16"/>
+        </w:rPr>
+        <w:t>Fig</w:t>
+      </w:r>
+      <w:r>
+        <w:rPr>
+          <w:sz w:val="16"/>
+          <w:szCs w:val="16"/>
+        </w:rPr>
+        <w:t xml:space="preserve">. </w:t>
+      </w:r>
+      <w:r>
+        <w:rPr>
+          <w:sz w:val="16"/>
+          <w:szCs w:val="16"/>
+        </w:rPr>
+        <w:t>4</w:t>
+      </w:r>
+      <w:r>
+        <w:rPr>
+          <w:sz w:val="16"/>
+          <w:szCs w:val="16"/>
+        </w:rPr>
+        <w:t>.</w:t>
+      </w:r>
+      <w:r>
+        <w:rPr>
+          <w:sz w:val="16"/>
+          <w:szCs w:val="16"/>
+        </w:rPr>
+        <w:t xml:space="preserve"> </w:t>
+      </w:r>
+      <w:proofErr w:type="spellStart"/>
+      <w:r>
+        <w:rPr>
+          <w:sz w:val="16"/>
+          <w:szCs w:val="16"/>
+        </w:rPr>
+        <w:t>XGBoost</w:t>
+      </w:r>
+      <w:proofErr w:type="spellEnd"/>
+      <w:r>
+        <w:rPr>
+          <w:sz w:val="16"/>
+          <w:szCs w:val="16"/>
+        </w:rPr>
+        <w:t xml:space="preserve"> model</w:t>
+      </w:r>
+      <w:r>
+        <w:rPr>
+          <w:sz w:val="16"/>
+          <w:szCs w:val="16"/>
+        </w:rPr>
+        <w:t xml:space="preserve"> Architecture</w:t>
+      </w:r>
+    </w:p>
+    <w:p>
+      <w:pPr>
+        <w:jc w:val="both"/>
+      </w:pPr>
+    </w:p>
+    <w:p>
+      <w:pPr>
+        <w:jc w:val="both"/>
+        <w:rPr>
+          <w:b/>
+          <w:bCs/>
+        </w:rPr>
+      </w:pPr>
+      <w:r>
+        <w:rPr>
+          <w:b/>
+          <w:bCs/>
+        </w:rPr>
+        <w:t>G. Thermal Risk Score (TRS) Formulation</w:t>
+      </w:r>
+    </w:p>
+    <w:p>
+      <w:pPr>
+        <w:jc w:val="both"/>
+      </w:pPr>
+      <w:r>
+        <w:t>The Thermal Risk Score (TRS) is calculated by using a weighted equation of the mean, standard deviation, and entropy of the thermograms as follows:</w:t>
+      </w:r>
+    </w:p>
+    <w:p>
+      <w:pPr>
+        <w:jc w:val="both"/>
+      </w:pPr>
+    </w:p>
+    <w:p>
+      <w:pPr>
+        <w:jc w:val="both"/>
+      </w:pPr>
+    </w:p>
+    <w:p>
+      <w:pPr>
+        <w:jc w:val="both"/>
+      </w:pPr>
+      <m:oMath>
+        <m:r>
+          <w:rPr>
+            <w:rFonts w:ascii="Cambria Math" w:hAnsi="Cambria Math"/>
+          </w:rPr>
+          <w:lastRenderedPageBreak/>
+          <m:t>TRS=</m:t>
+        </m:r>
+        <m:r>
+          <w:rPr>
+            <w:rFonts w:ascii="Cambria Math" w:hAnsi="Cambria Math"/>
+          </w:rPr>
+          <m:t>0.4⋅μ+0.3⋅σ+0.3⋅H</m:t>
+        </m:r>
+      </m:oMath>
+      <w:r>
+        <w:t xml:space="preserve">                                       (3)</w:t>
+      </w:r>
+      <m:oMath>
+        <m:r>
+          <m:rPr>
+            <m:sty m:val="p"/>
+          </m:rPr>
+          <w:br/>
+        </m:r>
+      </m:oMath>
     </w:p>
     <w:p>
       <w:pPr>
@@ -2396,6 +3125,16 @@
     </w:p>
     <w:p>
       <w:pPr>
+        <w:jc w:val="both"/>
+      </w:pPr>
+    </w:p>
+    <w:p>
+      <w:pPr>
+        <w:jc w:val="both"/>
+      </w:pPr>
+    </w:p>
+    <w:p>
+      <w:pPr>
         <w:pStyle w:val="Heading1"/>
       </w:pPr>
       <w:r>
@@ -2454,11 +3193,7 @@
         <w:t xml:space="preserve"> notebooks for building training scripts. TensorFlow and NumPy frameworks were mainly used for building and training these CNN backbones. </w:t>
       </w:r>
       <w:r>
-        <w:t xml:space="preserve">The CNN learns hierarchical representations of thermal patterns without manual feature </w:t>
-      </w:r>
-      <w:r>
-        <w:lastRenderedPageBreak/>
-        <w:t>engineering. The trained CNN does Deep feature extraction for hybrid modeling.</w:t>
+        <w:t>The CNN learns hierarchical representations of thermal patterns without manual feature engineering. The trained CNN does Deep feature extraction for hybrid modeling.</w:t>
       </w:r>
     </w:p>
     <w:p>
@@ -2571,7 +3306,13 @@
         <w:jc w:val="both"/>
       </w:pPr>
       <w:r>
-        <w:t xml:space="preserve">Out of all the models, MobileNetV2 </w:t>
+        <w:t>Out of all the models,</w:t>
+      </w:r>
+      <w:r>
+        <w:t xml:space="preserve"> EfficientNet-B0 with normalization of input images was the least performer with 79.51% accuracy.</w:t>
+      </w:r>
+      <w:r>
+        <w:t xml:space="preserve"> MobileNetV2 </w:t>
       </w:r>
       <w:r>
         <w:t>was the</w:t>
@@ -2580,20 +3321,24 @@
         <w:t xml:space="preserve"> </w:t>
       </w:r>
       <w:r>
-        <w:t>best performer and</w:t>
-      </w:r>
-      <w:r>
-        <w:t xml:space="preserve"> was selected for </w:t>
-      </w:r>
-      <w:r>
-        <w:t xml:space="preserve">this </w:t>
-      </w:r>
-      <w:r>
-        <w:t>system implementation</w:t>
-      </w:r>
-      <w:r>
-        <w:t xml:space="preserve">. </w:t>
-      </w:r>
+        <w:t xml:space="preserve">best performer </w:t>
+      </w:r>
+      <w:r>
+        <w:t>with 91.45% accuracy.</w:t>
+      </w:r>
+    </w:p>
+    <w:p>
+      <w:pPr>
+        <w:jc w:val="both"/>
+      </w:pPr>
+      <w:r>
+        <w:t xml:space="preserve">It also has good precision of 92.34%, recall of 93.43%, negative predictive value of 90.10% and F1 score of 92.88% showing its robustness for this task. </w:t>
+      </w:r>
+    </w:p>
+    <w:p>
+      <w:pPr>
+        <w:jc w:val="both"/>
+      </w:pPr>
       <w:r>
         <w:t xml:space="preserve">As shown in Fig. 4, this </w:t>
       </w:r>
@@ -2610,7 +3355,10 @@
         <w:t>classification results, indicating</w:t>
       </w:r>
       <w:r>
-        <w:t xml:space="preserve"> deep convolutional features effectively capture thermal pattern differences.</w:t>
+        <w:t xml:space="preserve"> deep convolutional features effectively capture thermal pattern differences</w:t>
+      </w:r>
+      <w:r>
+        <w:t xml:space="preserve"> and was selected for further system implementation.</w:t>
       </w:r>
     </w:p>
     <w:p>
@@ -4055,7 +4803,7 @@
                     </pic:cNvPicPr>
                   </pic:nvPicPr>
                   <pic:blipFill>
-                    <a:blip r:embed="rId13">
+                    <a:blip r:embed="rId15">
                       <a:extLst>
                         <a:ext uri="{28A0092B-C50C-407E-A947-70E740481C1C}">
                           <a14:useLocalDpi xmlns:a14="http://schemas.microsoft.com/office/drawing/2010/main" val="0"/>
@@ -4108,7 +4856,7 @@
                     </pic:cNvPicPr>
                   </pic:nvPicPr>
                   <pic:blipFill>
-                    <a:blip r:embed="rId14" cstate="print">
+                    <a:blip r:embed="rId16" cstate="print">
                       <a:extLst>
                         <a:ext uri="{28A0092B-C50C-407E-A947-70E740481C1C}">
                           <a14:useLocalDpi xmlns:a14="http://schemas.microsoft.com/office/drawing/2010/main" val="0"/>
@@ -4160,7 +4908,21 @@
           <w:sz w:val="16"/>
           <w:szCs w:val="16"/>
         </w:rPr>
-        <w:t>Fig. 4.</w:t>
+        <w:t xml:space="preserve">Fig. </w:t>
+      </w:r>
+      <w:r>
+        <w:rPr>
+          <w:sz w:val="16"/>
+          <w:szCs w:val="16"/>
+        </w:rPr>
+        <w:t>5</w:t>
+      </w:r>
+      <w:r>
+        <w:rPr>
+          <w:sz w:val="16"/>
+          <w:szCs w:val="16"/>
+        </w:rPr>
+        <w:t>.</w:t>
       </w:r>
       <w:r>
         <w:rPr>
@@ -4280,16 +5042,6 @@
       <w:r>
         <w:t>.</w:t>
       </w:r>
-    </w:p>
-    <w:p>
-      <w:pPr>
-        <w:jc w:val="both"/>
-      </w:pPr>
-    </w:p>
-    <w:p>
-      <w:pPr>
-        <w:jc w:val="both"/>
-      </w:pPr>
     </w:p>
     <w:p>
       <w:pPr>
@@ -5121,7 +5873,11 @@
         <w:t xml:space="preserve"> </w:t>
       </w:r>
       <w:r>
-        <w:t>Using entropy and temperature variability improves sensitivity to small thermal irregularities that may not be fully understood by deep features only. The advantage of using learned deep features with meaningful thermal statistical features is backed by the lower RMSE and MAE metric values.</w:t>
+        <w:t xml:space="preserve">Using entropy and temperature variability </w:t>
+      </w:r>
+      <w:r>
+        <w:lastRenderedPageBreak/>
+        <w:t>improves sensitivity to small thermal irregularities that may not be fully understood by deep features only. The advantage of using learned deep features with meaningful thermal statistical features is backed by the lower RMSE and MAE metric values.</w:t>
       </w:r>
     </w:p>
     <w:p>
@@ -5176,7 +5932,7 @@
                     </pic:cNvPicPr>
                   </pic:nvPicPr>
                   <pic:blipFill>
-                    <a:blip r:embed="rId15" cstate="print">
+                    <a:blip r:embed="rId17" cstate="print">
                       <a:extLst>
                         <a:ext uri="{28A0092B-C50C-407E-A947-70E740481C1C}">
                           <a14:useLocalDpi xmlns:a14="http://schemas.microsoft.com/office/drawing/2010/main" val="0"/>
@@ -5220,7 +5976,21 @@
           <w:sz w:val="16"/>
           <w:szCs w:val="16"/>
         </w:rPr>
-        <w:t>Fig. 5. Thermal Risk Score Distribution of Dataset Images</w:t>
+        <w:t xml:space="preserve">Fig. </w:t>
+      </w:r>
+      <w:r>
+        <w:rPr>
+          <w:sz w:val="16"/>
+          <w:szCs w:val="16"/>
+        </w:rPr>
+        <w:t>6</w:t>
+      </w:r>
+      <w:r>
+        <w:rPr>
+          <w:sz w:val="16"/>
+          <w:szCs w:val="16"/>
+        </w:rPr>
+        <w:t>. Thermal Risk Score Distribution of Dataset Images</w:t>
       </w:r>
     </w:p>
     <w:p>
@@ -5288,7 +6058,6 @@
         <w:rPr>
           <w:noProof/>
         </w:rPr>
-        <w:lastRenderedPageBreak/>
         <w:drawing>
           <wp:inline distT="0" distB="0" distL="0" distR="0" wp14:anchorId="40C249C0" wp14:editId="3F855547">
             <wp:extent cx="1437773" cy="833852"/>
@@ -5307,7 +6076,7 @@
                     </pic:cNvPicPr>
                   </pic:nvPicPr>
                   <pic:blipFill>
-                    <a:blip r:embed="rId16" cstate="print">
+                    <a:blip r:embed="rId18" cstate="print">
                       <a:extLst>
                         <a:ext uri="{28A0092B-C50C-407E-A947-70E740481C1C}">
                           <a14:useLocalDpi xmlns:a14="http://schemas.microsoft.com/office/drawing/2010/main" val="0"/>
@@ -5360,7 +6129,7 @@
                     </pic:cNvPicPr>
                   </pic:nvPicPr>
                   <pic:blipFill>
-                    <a:blip r:embed="rId17" cstate="print">
+                    <a:blip r:embed="rId19" cstate="print">
                       <a:extLst>
                         <a:ext uri="{28A0092B-C50C-407E-A947-70E740481C1C}">
                           <a14:useLocalDpi xmlns:a14="http://schemas.microsoft.com/office/drawing/2010/main" val="0"/>
@@ -5404,15 +6173,28 @@
         <w:rPr>
           <w:sz w:val="16"/>
           <w:szCs w:val="16"/>
-          <w:u w:val="single"/>
-        </w:rPr>
-        <w:t xml:space="preserve">Fig. 6. </w:t>
+        </w:rPr>
+        <w:t xml:space="preserve">Fig. </w:t>
       </w:r>
       <w:r>
         <w:rPr>
           <w:sz w:val="16"/>
           <w:szCs w:val="16"/>
         </w:rPr>
+        <w:t>7</w:t>
+      </w:r>
+      <w:r>
+        <w:rPr>
+          <w:sz w:val="16"/>
+          <w:szCs w:val="16"/>
+        </w:rPr>
+        <w:t xml:space="preserve">. </w:t>
+      </w:r>
+      <w:r>
+        <w:rPr>
+          <w:sz w:val="16"/>
+          <w:szCs w:val="16"/>
+        </w:rPr>
         <w:t>K-Means clustering for risk stratification (a) Scatter plot showing clusters (b) Box plot showing cluster distributions</w:t>
       </w:r>
     </w:p>
@@ -5453,7 +6235,10 @@
         <w:tab/>
       </w:r>
       <w:r>
-        <w:t>This paper presents a Model-based Thermal Risk Score (TRS) framework for Diabetic Neuropathy classification using infrared thermograms of the sole of the foot of patients. Instead of performing a simple binary classification or using predefined temperature thresholds, this work integrates deep learning, image feature extraction and unsupervised clustering to enable a structured risk classification.</w:t>
+        <w:t xml:space="preserve">This paper presents a Model-based Thermal Risk Score (TRS) framework for Diabetic Neuropathy classification using infrared thermograms of the sole of the foot of patients. Instead of performing a simple binary classification or using predefined temperature thresholds, this work integrates deep </w:t>
+      </w:r>
+      <w:r>
+        <w:t>learning, image feature extraction and unsupervised clustering to enable a structured risk classification.</w:t>
       </w:r>
     </w:p>
     <w:p>
@@ -5576,10 +6361,7 @@
       </w:r>
       <w:r>
         <w:br/>
-        <w:t xml:space="preserve"> “Infrared thermal imaging for automated detection of diabetic foot </w:t>
-      </w:r>
-      <w:r>
-        <w:t>complications,”</w:t>
+        <w:t xml:space="preserve"> “Infrared thermal imaging for automated detection of diabetic foot complications,”</w:t>
       </w:r>
       <w:r>
         <w:br/>
@@ -5821,6 +6603,7 @@
         <w:jc w:val="start"/>
       </w:pPr>
       <w:r>
+        <w:lastRenderedPageBreak/>
         <w:t>A. J. M. Boulton, L. Vileikyte, G. Ragnarson-Tennvall, and J. Apelqvist,</w:t>
       </w:r>
       <w:r>
@@ -8557,6 +9340,7 @@
   <w:style w:type="paragraph" w:default="1" w:styleId="Normal">
     <w:name w:val="Normal"/>
     <w:qFormat/>
+    <w:rsid w:val="009236DE"/>
     <w:pPr>
       <w:jc w:val="center"/>
     </w:pPr>
@@ -9010,6 +9794,27 @@
       <w:szCs w:val="24"/>
     </w:rPr>
   </w:style>
+  <w:style w:type="paragraph" w:styleId="ListParagraph">
+    <w:name w:val="List Paragraph"/>
+    <w:basedOn w:val="Normal"/>
+    <w:uiPriority w:val="34"/>
+    <w:qFormat/>
+    <w:rsid w:val="006F38CA"/>
+    <w:pPr>
+      <w:ind w:start="36pt"/>
+      <w:contextualSpacing/>
+    </w:pPr>
+  </w:style>
+  <w:style w:type="character" w:styleId="PlaceholderText">
+    <w:name w:val="Placeholder Text"/>
+    <w:basedOn w:val="DefaultParagraphFont"/>
+    <w:uiPriority w:val="99"/>
+    <w:semiHidden/>
+    <w:rsid w:val="00B04A94"/>
+    <w:rPr>
+      <w:color w:val="666666"/>
+    </w:rPr>
+  </w:style>
 </w:styles>
 </file>
 

</xml_diff>